<commit_message>
feat(main): add lab files
</commit_message>
<xml_diff>
--- a/labs/lab09/report/os-intro--lab09--report.docx
+++ b/labs/lab09/report/os-intro--lab09--report.docx
@@ -76,7 +76,7 @@
       </w:r>
     </w:p>
     <w:bookmarkEnd w:id="20"/>
-    <w:bookmarkStart w:id="154" w:name="выполнение-лабораторной-работы"/>
+    <w:bookmarkStart w:id="157" w:name="выполнение-лабораторной-работы"/>
     <w:p>
       <w:pPr>
         <w:pStyle w:val="Heading1"/>
@@ -465,42 +465,7 @@
         <w:t xml:space="preserve">4 Выполните основные команды меню левой панели.</w:t>
       </w:r>
     </w:p>
-    <w:bookmarkStart w:id="45" w:name="fig:007"/>
-    <w:tbl>
-      <w:tblPr>
-        <w:tblStyle w:val="FigureTable"/>
-        <w:tblW w:type="auto" w:w="0"/>
-        <w:jc w:val="center"/>
-        <w:tblLook w:firstRow="0" w:lastRow="0" w:firstColumn="0" w:lastColumn="0"/>
-      </w:tblPr>
-      <w:tblGrid>
-        <w:gridCol w:w="7920"/>
-      </w:tblGrid>
-      <w:tr>
-        <w:tc>
-          <w:tcPr/>
-          <w:p>
-            <w:pPr>
-              <w:pStyle w:val="Compact"/>
-              <w:jc w:val="center"/>
-            </w:pPr>
-            <w:r>
-              <w:t xml:space="preserve">Быстрый просмотр</w:t>
-            </w:r>
-          </w:p>
-        </w:tc>
-      </w:tr>
-    </w:tbl>
-    <w:p>
-      <w:pPr>
-        <w:pStyle w:val="ImageCaption"/>
-      </w:pPr>
-      <w:r>
-        <w:t xml:space="preserve">Быстрый просмотр</w:t>
-      </w:r>
-    </w:p>
-    <w:bookmarkEnd w:id="45"/>
-    <w:bookmarkStart w:id="49" w:name="fig:008"/>
+    <w:bookmarkStart w:id="48" w:name="fig:007"/>
     <w:p>
       <w:pPr>
         <w:pStyle w:val="CaptionedFigure"/>
@@ -508,20 +473,77 @@
       <w:r>
         <w:drawing>
           <wp:inline>
-            <wp:extent cx="3733800" cy="2940499"/>
+            <wp:extent cx="3733800" cy="2944570"/>
             <wp:effectExtent b="0" l="0" r="0" t="0"/>
-            <wp:docPr descr="Информация" title="" id="47" name="Picture"/>
+            <wp:docPr descr="Быстрый просмотр" title="" id="46" name="Picture"/>
             <a:graphic>
               <a:graphicData uri="http://schemas.openxmlformats.org/drawingml/2006/picture">
                 <pic:pic>
                   <pic:nvPicPr>
-                    <pic:cNvPr descr="image/08.png" id="48" name="Picture"/>
+                    <pic:cNvPr descr="image/07.png" id="47" name="Picture"/>
                     <pic:cNvPicPr>
                       <a:picLocks noChangeArrowheads="1" noChangeAspect="1"/>
                     </pic:cNvPicPr>
                   </pic:nvPicPr>
                   <pic:blipFill>
-                    <a:blip r:embed="rId46"/>
+                    <a:blip r:embed="rId45"/>
+                    <a:stretch>
+                      <a:fillRect/>
+                    </a:stretch>
+                  </pic:blipFill>
+                  <pic:spPr bwMode="auto">
+                    <a:xfrm>
+                      <a:off x="0" y="0"/>
+                      <a:ext cx="3733800" cy="2944570"/>
+                    </a:xfrm>
+                    <a:prstGeom prst="rect">
+                      <a:avLst/>
+                    </a:prstGeom>
+                    <a:noFill/>
+                    <a:ln w="9525">
+                      <a:noFill/>
+                      <a:headEnd/>
+                      <a:tailEnd/>
+                    </a:ln>
+                  </pic:spPr>
+                </pic:pic>
+              </a:graphicData>
+            </a:graphic>
+          </wp:inline>
+        </w:drawing>
+      </w:r>
+    </w:p>
+    <w:p>
+      <w:pPr>
+        <w:pStyle w:val="ImageCaption"/>
+      </w:pPr>
+      <w:r>
+        <w:t xml:space="preserve">Быстрый просмотр</w:t>
+      </w:r>
+    </w:p>
+    <w:bookmarkEnd w:id="48"/>
+    <w:bookmarkStart w:id="52" w:name="fig:008"/>
+    <w:p>
+      <w:pPr>
+        <w:pStyle w:val="CaptionedFigure"/>
+      </w:pPr>
+      <w:r>
+        <w:drawing>
+          <wp:inline>
+            <wp:extent cx="3733800" cy="2940499"/>
+            <wp:effectExtent b="0" l="0" r="0" t="0"/>
+            <wp:docPr descr="Информация" title="" id="50" name="Picture"/>
+            <a:graphic>
+              <a:graphicData uri="http://schemas.openxmlformats.org/drawingml/2006/picture">
+                <pic:pic>
+                  <pic:nvPicPr>
+                    <pic:cNvPr descr="image/08.png" id="51" name="Picture"/>
+                    <pic:cNvPicPr>
+                      <a:picLocks noChangeArrowheads="1" noChangeAspect="1"/>
+                    </pic:cNvPicPr>
+                  </pic:nvPicPr>
+                  <pic:blipFill>
+                    <a:blip r:embed="rId49"/>
                     <a:stretch>
                       <a:fillRect/>
                     </a:stretch>
@@ -556,8 +578,8 @@
         <w:t xml:space="preserve">Информация</w:t>
       </w:r>
     </w:p>
-    <w:bookmarkEnd w:id="49"/>
-    <w:bookmarkStart w:id="53" w:name="fig:009"/>
+    <w:bookmarkEnd w:id="52"/>
+    <w:bookmarkStart w:id="56" w:name="fig:009"/>
     <w:p>
       <w:pPr>
         <w:pStyle w:val="CaptionedFigure"/>
@@ -567,18 +589,18 @@
           <wp:inline>
             <wp:extent cx="3733800" cy="2944570"/>
             <wp:effectExtent b="0" l="0" r="0" t="0"/>
-            <wp:docPr descr="Дерево каталогов" title="" id="51" name="Picture"/>
+            <wp:docPr descr="Дерево каталогов" title="" id="54" name="Picture"/>
             <a:graphic>
               <a:graphicData uri="http://schemas.openxmlformats.org/drawingml/2006/picture">
                 <pic:pic>
                   <pic:nvPicPr>
-                    <pic:cNvPr descr="image/09.png" id="52" name="Picture"/>
+                    <pic:cNvPr descr="image/09.png" id="55" name="Picture"/>
                     <pic:cNvPicPr>
                       <a:picLocks noChangeArrowheads="1" noChangeAspect="1"/>
                     </pic:cNvPicPr>
                   </pic:nvPicPr>
                   <pic:blipFill>
-                    <a:blip r:embed="rId50"/>
+                    <a:blip r:embed="rId53"/>
                     <a:stretch>
                       <a:fillRect/>
                     </a:stretch>
@@ -613,7 +635,7 @@
         <w:t xml:space="preserve">Дерево каталогов</w:t>
       </w:r>
     </w:p>
-    <w:bookmarkEnd w:id="53"/>
+    <w:bookmarkEnd w:id="56"/>
     <w:p>
       <w:pPr>
         <w:pStyle w:val="BodyText"/>
@@ -622,7 +644,7 @@
         <w:t xml:space="preserve">5 Используя возможности подменю Файл , выполним:</w:t>
       </w:r>
     </w:p>
-    <w:bookmarkStart w:id="57" w:name="fig:010"/>
+    <w:bookmarkStart w:id="60" w:name="fig:010"/>
     <w:p>
       <w:pPr>
         <w:pStyle w:val="CaptionedFigure"/>
@@ -632,18 +654,18 @@
           <wp:inline>
             <wp:extent cx="3733800" cy="2977767"/>
             <wp:effectExtent b="0" l="0" r="0" t="0"/>
-            <wp:docPr descr="Просмотр содержимого текстового файла" title="" id="55" name="Picture"/>
+            <wp:docPr descr="Просмотр содержимого текстового файла" title="" id="58" name="Picture"/>
             <a:graphic>
               <a:graphicData uri="http://schemas.openxmlformats.org/drawingml/2006/picture">
                 <pic:pic>
                   <pic:nvPicPr>
-                    <pic:cNvPr descr="image/10.png" id="56" name="Picture"/>
+                    <pic:cNvPr descr="image/10.png" id="59" name="Picture"/>
                     <pic:cNvPicPr>
                       <a:picLocks noChangeArrowheads="1" noChangeAspect="1"/>
                     </pic:cNvPicPr>
                   </pic:nvPicPr>
                   <pic:blipFill>
-                    <a:blip r:embed="rId54"/>
+                    <a:blip r:embed="rId57"/>
                     <a:stretch>
                       <a:fillRect/>
                     </a:stretch>
@@ -678,8 +700,8 @@
         <w:t xml:space="preserve">Просмотр содержимого текстового файла</w:t>
       </w:r>
     </w:p>
-    <w:bookmarkEnd w:id="57"/>
-    <w:bookmarkStart w:id="61" w:name="fig:011"/>
+    <w:bookmarkEnd w:id="60"/>
+    <w:bookmarkStart w:id="64" w:name="fig:011"/>
     <w:p>
       <w:pPr>
         <w:pStyle w:val="CaptionedFigure"/>
@@ -689,18 +711,18 @@
           <wp:inline>
             <wp:extent cx="3733800" cy="2979209"/>
             <wp:effectExtent b="0" l="0" r="0" t="0"/>
-            <wp:docPr descr="Отредактируем содержимое текстового файла без сохранения результатов" title="" id="59" name="Picture"/>
+            <wp:docPr descr="Отредактируем содержимое текстового файла без сохранения результатов" title="" id="62" name="Picture"/>
             <a:graphic>
               <a:graphicData uri="http://schemas.openxmlformats.org/drawingml/2006/picture">
                 <pic:pic>
                   <pic:nvPicPr>
-                    <pic:cNvPr descr="image/11.png" id="60" name="Picture"/>
+                    <pic:cNvPr descr="image/11.png" id="63" name="Picture"/>
                     <pic:cNvPicPr>
                       <a:picLocks noChangeArrowheads="1" noChangeAspect="1"/>
                     </pic:cNvPicPr>
                   </pic:nvPicPr>
                   <pic:blipFill>
-                    <a:blip r:embed="rId58"/>
+                    <a:blip r:embed="rId61"/>
                     <a:stretch>
                       <a:fillRect/>
                     </a:stretch>
@@ -735,8 +757,8 @@
         <w:t xml:space="preserve">Отредактируем содержимое текстового файла без сохранения результатов</w:t>
       </w:r>
     </w:p>
-    <w:bookmarkEnd w:id="61"/>
-    <w:bookmarkStart w:id="65" w:name="fig:012"/>
+    <w:bookmarkEnd w:id="64"/>
+    <w:bookmarkStart w:id="68" w:name="fig:012"/>
     <w:p>
       <w:pPr>
         <w:pStyle w:val="CaptionedFigure"/>
@@ -746,18 +768,18 @@
           <wp:inline>
             <wp:extent cx="3733800" cy="2950162"/>
             <wp:effectExtent b="0" l="0" r="0" t="0"/>
-            <wp:docPr descr="Создание каталога" title="" id="63" name="Picture"/>
+            <wp:docPr descr="Создание каталога" title="" id="66" name="Picture"/>
             <a:graphic>
               <a:graphicData uri="http://schemas.openxmlformats.org/drawingml/2006/picture">
                 <pic:pic>
                   <pic:nvPicPr>
-                    <pic:cNvPr descr="image/12.png" id="64" name="Picture"/>
+                    <pic:cNvPr descr="image/12.png" id="67" name="Picture"/>
                     <pic:cNvPicPr>
                       <a:picLocks noChangeArrowheads="1" noChangeAspect="1"/>
                     </pic:cNvPicPr>
                   </pic:nvPicPr>
                   <pic:blipFill>
-                    <a:blip r:embed="rId62"/>
+                    <a:blip r:embed="rId65"/>
                     <a:stretch>
                       <a:fillRect/>
                     </a:stretch>
@@ -792,8 +814,8 @@
         <w:t xml:space="preserve">Создание каталога</w:t>
       </w:r>
     </w:p>
-    <w:bookmarkEnd w:id="65"/>
-    <w:bookmarkStart w:id="69" w:name="fig:013"/>
+    <w:bookmarkEnd w:id="68"/>
+    <w:bookmarkStart w:id="72" w:name="fig:013"/>
     <w:p>
       <w:pPr>
         <w:pStyle w:val="CaptionedFigure"/>
@@ -803,18 +825,18 @@
           <wp:inline>
             <wp:extent cx="3733800" cy="2953708"/>
             <wp:effectExtent b="0" l="0" r="0" t="0"/>
-            <wp:docPr descr="Копирование в файлов в созданный каталог" title="" id="67" name="Picture"/>
+            <wp:docPr descr="Копирование в файлов в созданный каталог" title="" id="70" name="Picture"/>
             <a:graphic>
               <a:graphicData uri="http://schemas.openxmlformats.org/drawingml/2006/picture">
                 <pic:pic>
                   <pic:nvPicPr>
-                    <pic:cNvPr descr="image/13.png" id="68" name="Picture"/>
+                    <pic:cNvPr descr="image/13.png" id="71" name="Picture"/>
                     <pic:cNvPicPr>
                       <a:picLocks noChangeArrowheads="1" noChangeAspect="1"/>
                     </pic:cNvPicPr>
                   </pic:nvPicPr>
                   <pic:blipFill>
-                    <a:blip r:embed="rId66"/>
+                    <a:blip r:embed="rId69"/>
                     <a:stretch>
                       <a:fillRect/>
                     </a:stretch>
@@ -849,7 +871,7 @@
         <w:t xml:space="preserve">Копирование в файлов в созданный каталог</w:t>
       </w:r>
     </w:p>
-    <w:bookmarkEnd w:id="69"/>
+    <w:bookmarkEnd w:id="72"/>
     <w:p>
       <w:pPr>
         <w:pStyle w:val="Compact"/>
@@ -862,7 +884,7 @@
         <w:t xml:space="preserve">С помощью соответствующих средств подменю Команда осуществите:</w:t>
       </w:r>
     </w:p>
-    <w:bookmarkStart w:id="73" w:name="fig:014"/>
+    <w:bookmarkStart w:id="76" w:name="fig:014"/>
     <w:p>
       <w:pPr>
         <w:pStyle w:val="CaptionedFigure"/>
@@ -872,18 +894,18 @@
           <wp:inline>
             <wp:extent cx="3733800" cy="2955776"/>
             <wp:effectExtent b="0" l="0" r="0" t="0"/>
-            <wp:docPr descr="Поиск файлов" title="" id="71" name="Picture"/>
+            <wp:docPr descr="Поиск файлов" title="" id="74" name="Picture"/>
             <a:graphic>
               <a:graphicData uri="http://schemas.openxmlformats.org/drawingml/2006/picture">
                 <pic:pic>
                   <pic:nvPicPr>
-                    <pic:cNvPr descr="image/14.png" id="72" name="Picture"/>
+                    <pic:cNvPr descr="image/14.png" id="75" name="Picture"/>
                     <pic:cNvPicPr>
                       <a:picLocks noChangeArrowheads="1" noChangeAspect="1"/>
                     </pic:cNvPicPr>
                   </pic:nvPicPr>
                   <pic:blipFill>
-                    <a:blip r:embed="rId70"/>
+                    <a:blip r:embed="rId73"/>
                     <a:stretch>
                       <a:fillRect/>
                     </a:stretch>
@@ -918,8 +940,8 @@
         <w:t xml:space="preserve">Поиск файлов</w:t>
       </w:r>
     </w:p>
-    <w:bookmarkEnd w:id="73"/>
-    <w:bookmarkStart w:id="77" w:name="fig:015"/>
+    <w:bookmarkEnd w:id="76"/>
+    <w:bookmarkStart w:id="80" w:name="fig:015"/>
     <w:p>
       <w:pPr>
         <w:pStyle w:val="CaptionedFigure"/>
@@ -929,18 +951,18 @@
           <wp:inline>
             <wp:extent cx="3733800" cy="1222610"/>
             <wp:effectExtent b="0" l="0" r="0" t="0"/>
-            <wp:docPr descr="История команд" title="" id="75" name="Picture"/>
+            <wp:docPr descr="История команд" title="" id="78" name="Picture"/>
             <a:graphic>
               <a:graphicData uri="http://schemas.openxmlformats.org/drawingml/2006/picture">
                 <pic:pic>
                   <pic:nvPicPr>
-                    <pic:cNvPr descr="image/15.png" id="76" name="Picture"/>
+                    <pic:cNvPr descr="image/15.png" id="79" name="Picture"/>
                     <pic:cNvPicPr>
                       <a:picLocks noChangeArrowheads="1" noChangeAspect="1"/>
                     </pic:cNvPicPr>
                   </pic:nvPicPr>
                   <pic:blipFill>
-                    <a:blip r:embed="rId74"/>
+                    <a:blip r:embed="rId77"/>
                     <a:stretch>
                       <a:fillRect/>
                     </a:stretch>
@@ -975,8 +997,8 @@
         <w:t xml:space="preserve">История команд</w:t>
       </w:r>
     </w:p>
-    <w:bookmarkEnd w:id="77"/>
-    <w:bookmarkStart w:id="81" w:name="fig:016"/>
+    <w:bookmarkEnd w:id="80"/>
+    <w:bookmarkStart w:id="84" w:name="fig:016"/>
     <w:p>
       <w:pPr>
         <w:pStyle w:val="CaptionedFigure"/>
@@ -986,18 +1008,18 @@
           <wp:inline>
             <wp:extent cx="3733800" cy="1312515"/>
             <wp:effectExtent b="0" l="0" r="0" t="0"/>
-            <wp:docPr descr="Переход в домашний каталог" title="" id="79" name="Picture"/>
+            <wp:docPr descr="Переход в домашний каталог" title="" id="82" name="Picture"/>
             <a:graphic>
               <a:graphicData uri="http://schemas.openxmlformats.org/drawingml/2006/picture">
                 <pic:pic>
                   <pic:nvPicPr>
-                    <pic:cNvPr descr="image/16.png" id="80" name="Picture"/>
+                    <pic:cNvPr descr="image/16.png" id="83" name="Picture"/>
                     <pic:cNvPicPr>
                       <a:picLocks noChangeArrowheads="1" noChangeAspect="1"/>
                     </pic:cNvPicPr>
                   </pic:nvPicPr>
                   <pic:blipFill>
-                    <a:blip r:embed="rId78"/>
+                    <a:blip r:embed="rId81"/>
                     <a:stretch>
                       <a:fillRect/>
                     </a:stretch>
@@ -1032,8 +1054,8 @@
         <w:t xml:space="preserve">Переход в домашний каталог</w:t>
       </w:r>
     </w:p>
-    <w:bookmarkEnd w:id="81"/>
-    <w:bookmarkStart w:id="85" w:name="fig:017"/>
+    <w:bookmarkEnd w:id="84"/>
+    <w:bookmarkStart w:id="88" w:name="fig:017"/>
     <w:p>
       <w:pPr>
         <w:pStyle w:val="CaptionedFigure"/>
@@ -1043,18 +1065,18 @@
           <wp:inline>
             <wp:extent cx="3733800" cy="2570018"/>
             <wp:effectExtent b="0" l="0" r="0" t="0"/>
-            <wp:docPr descr="Просмотр файла расширений" title="" id="83" name="Picture"/>
+            <wp:docPr descr="Просмотр файла расширений" title="" id="86" name="Picture"/>
             <a:graphic>
               <a:graphicData uri="http://schemas.openxmlformats.org/drawingml/2006/picture">
                 <pic:pic>
                   <pic:nvPicPr>
-                    <pic:cNvPr descr="image/17.png" id="84" name="Picture"/>
+                    <pic:cNvPr descr="image/17.png" id="87" name="Picture"/>
                     <pic:cNvPicPr>
                       <a:picLocks noChangeArrowheads="1" noChangeAspect="1"/>
                     </pic:cNvPicPr>
                   </pic:nvPicPr>
                   <pic:blipFill>
-                    <a:blip r:embed="rId82"/>
+                    <a:blip r:embed="rId85"/>
                     <a:stretch>
                       <a:fillRect/>
                     </a:stretch>
@@ -1089,8 +1111,8 @@
         <w:t xml:space="preserve">Просмотр файла расширений</w:t>
       </w:r>
     </w:p>
-    <w:bookmarkEnd w:id="85"/>
-    <w:bookmarkStart w:id="89" w:name="fig:018"/>
+    <w:bookmarkEnd w:id="88"/>
+    <w:bookmarkStart w:id="92" w:name="fig:018"/>
     <w:p>
       <w:pPr>
         <w:pStyle w:val="CaptionedFigure"/>
@@ -1100,18 +1122,18 @@
           <wp:inline>
             <wp:extent cx="3733800" cy="2556475"/>
             <wp:effectExtent b="0" l="0" r="0" t="0"/>
-            <wp:docPr descr="Просмотр файла меню" title="" id="87" name="Picture"/>
+            <wp:docPr descr="Просмотр файла меню" title="" id="90" name="Picture"/>
             <a:graphic>
               <a:graphicData uri="http://schemas.openxmlformats.org/drawingml/2006/picture">
                 <pic:pic>
                   <pic:nvPicPr>
-                    <pic:cNvPr descr="image/18.png" id="88" name="Picture"/>
+                    <pic:cNvPr descr="image/18.png" id="91" name="Picture"/>
                     <pic:cNvPicPr>
                       <a:picLocks noChangeArrowheads="1" noChangeAspect="1"/>
                     </pic:cNvPicPr>
                   </pic:nvPicPr>
                   <pic:blipFill>
-                    <a:blip r:embed="rId86"/>
+                    <a:blip r:embed="rId89"/>
                     <a:stretch>
                       <a:fillRect/>
                     </a:stretch>
@@ -1146,7 +1168,7 @@
         <w:t xml:space="preserve">Просмотр файла меню</w:t>
       </w:r>
     </w:p>
-    <w:bookmarkEnd w:id="89"/>
+    <w:bookmarkEnd w:id="92"/>
     <w:p>
       <w:pPr>
         <w:pStyle w:val="Compact"/>
@@ -1159,7 +1181,7 @@
         <w:t xml:space="preserve">Вызовем подменю Настройки. Изучим опции</w:t>
       </w:r>
     </w:p>
-    <w:bookmarkStart w:id="93" w:name="fig:019"/>
+    <w:bookmarkStart w:id="96" w:name="fig:019"/>
     <w:p>
       <w:pPr>
         <w:pStyle w:val="CaptionedFigure"/>
@@ -1169,18 +1191,18 @@
           <wp:inline>
             <wp:extent cx="3733800" cy="2968404"/>
             <wp:effectExtent b="0" l="0" r="0" t="0"/>
-            <wp:docPr descr="Конфигурация" title="" id="91" name="Picture"/>
+            <wp:docPr descr="Конфигурация" title="" id="94" name="Picture"/>
             <a:graphic>
               <a:graphicData uri="http://schemas.openxmlformats.org/drawingml/2006/picture">
                 <pic:pic>
                   <pic:nvPicPr>
-                    <pic:cNvPr descr="image/19.png" id="92" name="Picture"/>
+                    <pic:cNvPr descr="image/19.png" id="95" name="Picture"/>
                     <pic:cNvPicPr>
                       <a:picLocks noChangeArrowheads="1" noChangeAspect="1"/>
                     </pic:cNvPicPr>
                   </pic:nvPicPr>
                   <pic:blipFill>
-                    <a:blip r:embed="rId90"/>
+                    <a:blip r:embed="rId93"/>
                     <a:stretch>
                       <a:fillRect/>
                     </a:stretch>
@@ -1215,8 +1237,8 @@
         <w:t xml:space="preserve">Конфигурация</w:t>
       </w:r>
     </w:p>
-    <w:bookmarkEnd w:id="93"/>
-    <w:bookmarkStart w:id="97" w:name="fig:020"/>
+    <w:bookmarkEnd w:id="96"/>
+    <w:bookmarkStart w:id="100" w:name="fig:020"/>
     <w:p>
       <w:pPr>
         <w:pStyle w:val="CaptionedFigure"/>
@@ -1226,18 +1248,18 @@
           <wp:inline>
             <wp:extent cx="3733800" cy="2151446"/>
             <wp:effectExtent b="0" l="0" r="0" t="0"/>
-            <wp:docPr descr="Внешний вид" title="" id="95" name="Picture"/>
+            <wp:docPr descr="Внешний вид" title="" id="98" name="Picture"/>
             <a:graphic>
               <a:graphicData uri="http://schemas.openxmlformats.org/drawingml/2006/picture">
                 <pic:pic>
                   <pic:nvPicPr>
-                    <pic:cNvPr descr="image/20.png" id="96" name="Picture"/>
+                    <pic:cNvPr descr="image/20.png" id="99" name="Picture"/>
                     <pic:cNvPicPr>
                       <a:picLocks noChangeArrowheads="1" noChangeAspect="1"/>
                     </pic:cNvPicPr>
                   </pic:nvPicPr>
                   <pic:blipFill>
-                    <a:blip r:embed="rId94"/>
+                    <a:blip r:embed="rId97"/>
                     <a:stretch>
                       <a:fillRect/>
                     </a:stretch>
@@ -1272,8 +1294,8 @@
         <w:t xml:space="preserve">Внешний вид</w:t>
       </w:r>
     </w:p>
-    <w:bookmarkEnd w:id="97"/>
-    <w:bookmarkStart w:id="101" w:name="fig:021"/>
+    <w:bookmarkEnd w:id="100"/>
+    <w:bookmarkStart w:id="104" w:name="fig:021"/>
     <w:p>
       <w:pPr>
         <w:pStyle w:val="CaptionedFigure"/>
@@ -1283,18 +1305,18 @@
           <wp:inline>
             <wp:extent cx="3733800" cy="2637808"/>
             <wp:effectExtent b="0" l="0" r="0" t="0"/>
-            <wp:docPr descr="Настройки панелей" title="" id="99" name="Picture"/>
+            <wp:docPr descr="Настройки панелей" title="" id="102" name="Picture"/>
             <a:graphic>
               <a:graphicData uri="http://schemas.openxmlformats.org/drawingml/2006/picture">
                 <pic:pic>
                   <pic:nvPicPr>
-                    <pic:cNvPr descr="image/21.png" id="100" name="Picture"/>
+                    <pic:cNvPr descr="image/21.png" id="103" name="Picture"/>
                     <pic:cNvPicPr>
                       <a:picLocks noChangeArrowheads="1" noChangeAspect="1"/>
                     </pic:cNvPicPr>
                   </pic:nvPicPr>
                   <pic:blipFill>
-                    <a:blip r:embed="rId98"/>
+                    <a:blip r:embed="rId101"/>
                     <a:stretch>
                       <a:fillRect/>
                     </a:stretch>
@@ -1329,8 +1351,8 @@
         <w:t xml:space="preserve">Настройки панелей</w:t>
       </w:r>
     </w:p>
-    <w:bookmarkEnd w:id="101"/>
-    <w:bookmarkStart w:id="105" w:name="fig:022"/>
+    <w:bookmarkEnd w:id="104"/>
+    <w:bookmarkStart w:id="108" w:name="fig:022"/>
     <w:p>
       <w:pPr>
         <w:pStyle w:val="CaptionedFigure"/>
@@ -1340,18 +1362,18 @@
           <wp:inline>
             <wp:extent cx="3296450" cy="1990164"/>
             <wp:effectExtent b="0" l="0" r="0" t="0"/>
-            <wp:docPr descr="Подтверждение" title="" id="103" name="Picture"/>
+            <wp:docPr descr="Подтверждение" title="" id="106" name="Picture"/>
             <a:graphic>
               <a:graphicData uri="http://schemas.openxmlformats.org/drawingml/2006/picture">
                 <pic:pic>
                   <pic:nvPicPr>
-                    <pic:cNvPr descr="image/22.png" id="104" name="Picture"/>
+                    <pic:cNvPr descr="image/22.png" id="107" name="Picture"/>
                     <pic:cNvPicPr>
                       <a:picLocks noChangeArrowheads="1" noChangeAspect="1"/>
                     </pic:cNvPicPr>
                   </pic:nvPicPr>
                   <pic:blipFill>
-                    <a:blip r:embed="rId102"/>
+                    <a:blip r:embed="rId105"/>
                     <a:stretch>
                       <a:fillRect/>
                     </a:stretch>
@@ -1386,8 +1408,8 @@
         <w:t xml:space="preserve">Подтверждение</w:t>
       </w:r>
     </w:p>
-    <w:bookmarkEnd w:id="105"/>
-    <w:bookmarkStart w:id="109" w:name="fig:023"/>
+    <w:bookmarkEnd w:id="108"/>
+    <w:bookmarkStart w:id="112" w:name="fig:023"/>
     <w:p>
       <w:pPr>
         <w:pStyle w:val="CaptionedFigure"/>
@@ -1397,18 +1419,18 @@
           <wp:inline>
             <wp:extent cx="3733800" cy="1433250"/>
             <wp:effectExtent b="0" l="0" r="0" t="0"/>
-            <wp:docPr descr="Оформление" title="" id="107" name="Picture"/>
+            <wp:docPr descr="Оформление" title="" id="110" name="Picture"/>
             <a:graphic>
               <a:graphicData uri="http://schemas.openxmlformats.org/drawingml/2006/picture">
                 <pic:pic>
                   <pic:nvPicPr>
-                    <pic:cNvPr descr="image/23.png" id="108" name="Picture"/>
+                    <pic:cNvPr descr="image/23.png" id="111" name="Picture"/>
                     <pic:cNvPicPr>
                       <a:picLocks noChangeArrowheads="1" noChangeAspect="1"/>
                     </pic:cNvPicPr>
                   </pic:nvPicPr>
                   <pic:blipFill>
-                    <a:blip r:embed="rId106"/>
+                    <a:blip r:embed="rId109"/>
                     <a:stretch>
                       <a:fillRect/>
                     </a:stretch>
@@ -1443,8 +1465,8 @@
         <w:t xml:space="preserve">Оформление</w:t>
       </w:r>
     </w:p>
-    <w:bookmarkEnd w:id="109"/>
-    <w:bookmarkStart w:id="113" w:name="fig:024"/>
+    <w:bookmarkEnd w:id="112"/>
+    <w:bookmarkStart w:id="116" w:name="fig:024"/>
     <w:p>
       <w:pPr>
         <w:pStyle w:val="CaptionedFigure"/>
@@ -1454,18 +1476,18 @@
           <wp:inline>
             <wp:extent cx="3733800" cy="1357092"/>
             <wp:effectExtent b="0" l="0" r="0" t="0"/>
-            <wp:docPr descr="Кодировка символов" title="" id="111" name="Picture"/>
+            <wp:docPr descr="Кодировка символов" title="" id="114" name="Picture"/>
             <a:graphic>
               <a:graphicData uri="http://schemas.openxmlformats.org/drawingml/2006/picture">
                 <pic:pic>
                   <pic:nvPicPr>
-                    <pic:cNvPr descr="image/24.png" id="112" name="Picture"/>
+                    <pic:cNvPr descr="image/24.png" id="115" name="Picture"/>
                     <pic:cNvPicPr>
                       <a:picLocks noChangeArrowheads="1" noChangeAspect="1"/>
                     </pic:cNvPicPr>
                   </pic:nvPicPr>
                   <pic:blipFill>
-                    <a:blip r:embed="rId110"/>
+                    <a:blip r:embed="rId113"/>
                     <a:stretch>
                       <a:fillRect/>
                     </a:stretch>
@@ -1500,8 +1522,8 @@
         <w:t xml:space="preserve">Кодировка символов</w:t>
       </w:r>
     </w:p>
-    <w:bookmarkEnd w:id="113"/>
-    <w:bookmarkStart w:id="117" w:name="fig:025"/>
+    <w:bookmarkEnd w:id="116"/>
+    <w:bookmarkStart w:id="120" w:name="fig:025"/>
     <w:p>
       <w:pPr>
         <w:pStyle w:val="CaptionedFigure"/>
@@ -1511,18 +1533,18 @@
           <wp:inline>
             <wp:extent cx="3733800" cy="2453791"/>
             <wp:effectExtent b="0" l="0" r="0" t="0"/>
-            <wp:docPr descr="Распознавание клавиш" title="" id="115" name="Picture"/>
+            <wp:docPr descr="Распознавание клавиш" title="" id="118" name="Picture"/>
             <a:graphic>
               <a:graphicData uri="http://schemas.openxmlformats.org/drawingml/2006/picture">
                 <pic:pic>
                   <pic:nvPicPr>
-                    <pic:cNvPr descr="image/25.png" id="116" name="Picture"/>
+                    <pic:cNvPr descr="image/25.png" id="119" name="Picture"/>
                     <pic:cNvPicPr>
                       <a:picLocks noChangeArrowheads="1" noChangeAspect="1"/>
                     </pic:cNvPicPr>
                   </pic:nvPicPr>
                   <pic:blipFill>
-                    <a:blip r:embed="rId114"/>
+                    <a:blip r:embed="rId117"/>
                     <a:stretch>
                       <a:fillRect/>
                     </a:stretch>
@@ -1557,7 +1579,7 @@
         <w:t xml:space="preserve">Распознавание клавиш</w:t>
       </w:r>
     </w:p>
-    <w:bookmarkEnd w:id="117"/>
+    <w:bookmarkEnd w:id="120"/>
     <w:p>
       <w:pPr>
         <w:pStyle w:val="BodyText"/>
@@ -1574,7 +1596,7 @@
         <w:t xml:space="preserve">9 Откроем этот файл с помощью встроенного в mc редактора, и вставим в открытый файл небольшой фрагмент текста, скопированный из любого другого файла или Интернета.</w:t>
       </w:r>
     </w:p>
-    <w:bookmarkStart w:id="121" w:name="fig:026"/>
+    <w:bookmarkStart w:id="124" w:name="fig:026"/>
     <w:p>
       <w:pPr>
         <w:pStyle w:val="CaptionedFigure"/>
@@ -1584,18 +1606,18 @@
           <wp:inline>
             <wp:extent cx="3733800" cy="2655229"/>
             <wp:effectExtent b="0" l="0" r="0" t="0"/>
-            <wp:docPr descr="Файл с текстом" title="" id="119" name="Picture"/>
+            <wp:docPr descr="Файл с текстом" title="" id="122" name="Picture"/>
             <a:graphic>
               <a:graphicData uri="http://schemas.openxmlformats.org/drawingml/2006/picture">
                 <pic:pic>
                   <pic:nvPicPr>
-                    <pic:cNvPr descr="image/26.png" id="120" name="Picture"/>
+                    <pic:cNvPr descr="image/26.png" id="123" name="Picture"/>
                     <pic:cNvPicPr>
                       <a:picLocks noChangeArrowheads="1" noChangeAspect="1"/>
                     </pic:cNvPicPr>
                   </pic:nvPicPr>
                   <pic:blipFill>
-                    <a:blip r:embed="rId118"/>
+                    <a:blip r:embed="rId121"/>
                     <a:stretch>
                       <a:fillRect/>
                     </a:stretch>
@@ -1630,7 +1652,7 @@
         <w:t xml:space="preserve">Файл с текстом</w:t>
       </w:r>
     </w:p>
-    <w:bookmarkEnd w:id="121"/>
+    <w:bookmarkEnd w:id="124"/>
     <w:p>
       <w:pPr>
         <w:pStyle w:val="BodyText"/>
@@ -1647,7 +1669,7 @@
         <w:t xml:space="preserve">Удалим строку текста. - F8</w:t>
       </w:r>
     </w:p>
-    <w:bookmarkStart w:id="125" w:name="fig:027"/>
+    <w:bookmarkStart w:id="128" w:name="fig:027"/>
     <w:p>
       <w:pPr>
         <w:pStyle w:val="CaptionedFigure"/>
@@ -1657,18 +1679,18 @@
           <wp:inline>
             <wp:extent cx="3733800" cy="2641980"/>
             <wp:effectExtent b="0" l="0" r="0" t="0"/>
-            <wp:docPr descr="Файл с текстом" title="" id="123" name="Picture"/>
+            <wp:docPr descr="Файл с текстом" title="" id="126" name="Picture"/>
             <a:graphic>
               <a:graphicData uri="http://schemas.openxmlformats.org/drawingml/2006/picture">
                 <pic:pic>
                   <pic:nvPicPr>
-                    <pic:cNvPr descr="image/27.png" id="124" name="Picture"/>
+                    <pic:cNvPr descr="image/27.png" id="127" name="Picture"/>
                     <pic:cNvPicPr>
                       <a:picLocks noChangeArrowheads="1" noChangeAspect="1"/>
                     </pic:cNvPicPr>
                   </pic:nvPicPr>
                   <pic:blipFill>
-                    <a:blip r:embed="rId122"/>
+                    <a:blip r:embed="rId125"/>
                     <a:stretch>
                       <a:fillRect/>
                     </a:stretch>
@@ -1703,7 +1725,7 @@
         <w:t xml:space="preserve">Файл с текстом</w:t>
       </w:r>
     </w:p>
-    <w:bookmarkEnd w:id="125"/>
+    <w:bookmarkEnd w:id="128"/>
     <w:p>
       <w:pPr>
         <w:pStyle w:val="BodyText"/>
@@ -1712,7 +1734,7 @@
         <w:t xml:space="preserve">Выделим фрагмент текста и скопируйте его на новую строку. - F5</w:t>
       </w:r>
     </w:p>
-    <w:bookmarkStart w:id="129" w:name="fig:028"/>
+    <w:bookmarkStart w:id="132" w:name="fig:028"/>
     <w:p>
       <w:pPr>
         <w:pStyle w:val="CaptionedFigure"/>
@@ -1722,18 +1744,18 @@
           <wp:inline>
             <wp:extent cx="3733800" cy="2621841"/>
             <wp:effectExtent b="0" l="0" r="0" t="0"/>
-            <wp:docPr descr="Копирование фрагмента" title="" id="127" name="Picture"/>
+            <wp:docPr descr="Копирование фрагмента" title="" id="130" name="Picture"/>
             <a:graphic>
               <a:graphicData uri="http://schemas.openxmlformats.org/drawingml/2006/picture">
                 <pic:pic>
                   <pic:nvPicPr>
-                    <pic:cNvPr descr="image/28.png" id="128" name="Picture"/>
+                    <pic:cNvPr descr="image/28.png" id="131" name="Picture"/>
                     <pic:cNvPicPr>
                       <a:picLocks noChangeArrowheads="1" noChangeAspect="1"/>
                     </pic:cNvPicPr>
                   </pic:nvPicPr>
                   <pic:blipFill>
-                    <a:blip r:embed="rId126"/>
+                    <a:blip r:embed="rId129"/>
                     <a:stretch>
                       <a:fillRect/>
                     </a:stretch>
@@ -1768,7 +1790,7 @@
         <w:t xml:space="preserve">Копирование фрагмента</w:t>
       </w:r>
     </w:p>
-    <w:bookmarkEnd w:id="129"/>
+    <w:bookmarkEnd w:id="132"/>
     <w:p>
       <w:pPr>
         <w:pStyle w:val="BodyText"/>
@@ -1777,7 +1799,7 @@
         <w:t xml:space="preserve">Сохраним файл. - F2</w:t>
       </w:r>
     </w:p>
-    <w:bookmarkStart w:id="133" w:name="fig:029"/>
+    <w:bookmarkStart w:id="136" w:name="fig:029"/>
     <w:p>
       <w:pPr>
         <w:pStyle w:val="CaptionedFigure"/>
@@ -1787,18 +1809,18 @@
           <wp:inline>
             <wp:extent cx="3733800" cy="2635623"/>
             <wp:effectExtent b="0" l="0" r="0" t="0"/>
-            <wp:docPr descr="Сохранение" title="" id="131" name="Picture"/>
+            <wp:docPr descr="Сохранение" title="" id="134" name="Picture"/>
             <a:graphic>
               <a:graphicData uri="http://schemas.openxmlformats.org/drawingml/2006/picture">
                 <pic:pic>
                   <pic:nvPicPr>
-                    <pic:cNvPr descr="image/29.png" id="132" name="Picture"/>
+                    <pic:cNvPr descr="image/29.png" id="135" name="Picture"/>
                     <pic:cNvPicPr>
                       <a:picLocks noChangeArrowheads="1" noChangeAspect="1"/>
                     </pic:cNvPicPr>
                   </pic:nvPicPr>
                   <pic:blipFill>
-                    <a:blip r:embed="rId130"/>
+                    <a:blip r:embed="rId133"/>
                     <a:stretch>
                       <a:fillRect/>
                     </a:stretch>
@@ -1833,7 +1855,7 @@
         <w:t xml:space="preserve">Сохранение</w:t>
       </w:r>
     </w:p>
-    <w:bookmarkEnd w:id="133"/>
+    <w:bookmarkEnd w:id="136"/>
     <w:p>
       <w:pPr>
         <w:pStyle w:val="BodyText"/>
@@ -1842,7 +1864,7 @@
         <w:t xml:space="preserve">Отменим последнее действие. - Ctrl+U</w:t>
       </w:r>
     </w:p>
-    <w:bookmarkStart w:id="137" w:name="fig:030"/>
+    <w:bookmarkStart w:id="140" w:name="fig:030"/>
     <w:p>
       <w:pPr>
         <w:pStyle w:val="CaptionedFigure"/>
@@ -1852,18 +1874,18 @@
           <wp:inline>
             <wp:extent cx="3733800" cy="2648349"/>
             <wp:effectExtent b="0" l="0" r="0" t="0"/>
-            <wp:docPr descr="Отмена" title="" id="135" name="Picture"/>
+            <wp:docPr descr="Отмена" title="" id="138" name="Picture"/>
             <a:graphic>
               <a:graphicData uri="http://schemas.openxmlformats.org/drawingml/2006/picture">
                 <pic:pic>
                   <pic:nvPicPr>
-                    <pic:cNvPr descr="image/30.png" id="136" name="Picture"/>
+                    <pic:cNvPr descr="image/30.png" id="139" name="Picture"/>
                     <pic:cNvPicPr>
                       <a:picLocks noChangeArrowheads="1" noChangeAspect="1"/>
                     </pic:cNvPicPr>
                   </pic:nvPicPr>
                   <pic:blipFill>
-                    <a:blip r:embed="rId134"/>
+                    <a:blip r:embed="rId137"/>
                     <a:stretch>
                       <a:fillRect/>
                     </a:stretch>
@@ -1898,7 +1920,7 @@
         <w:t xml:space="preserve">Отмена</w:t>
       </w:r>
     </w:p>
-    <w:bookmarkEnd w:id="137"/>
+    <w:bookmarkEnd w:id="140"/>
     <w:p>
       <w:pPr>
         <w:pStyle w:val="BodyText"/>
@@ -1907,7 +1929,7 @@
         <w:t xml:space="preserve">Перейдем в конец файла - PageDown или Ctrl+X</w:t>
       </w:r>
     </w:p>
-    <w:bookmarkStart w:id="141" w:name="fig:031"/>
+    <w:bookmarkStart w:id="144" w:name="fig:031"/>
     <w:p>
       <w:pPr>
         <w:pStyle w:val="CaptionedFigure"/>
@@ -1917,18 +1939,18 @@
           <wp:inline>
             <wp:extent cx="3733800" cy="2630378"/>
             <wp:effectExtent b="0" l="0" r="0" t="0"/>
-            <wp:docPr descr="Переход в конец файла" title="" id="139" name="Picture"/>
+            <wp:docPr descr="Переход в конец файла" title="" id="142" name="Picture"/>
             <a:graphic>
               <a:graphicData uri="http://schemas.openxmlformats.org/drawingml/2006/picture">
                 <pic:pic>
                   <pic:nvPicPr>
-                    <pic:cNvPr descr="image/31.png" id="140" name="Picture"/>
+                    <pic:cNvPr descr="image/31.png" id="143" name="Picture"/>
                     <pic:cNvPicPr>
                       <a:picLocks noChangeArrowheads="1" noChangeAspect="1"/>
                     </pic:cNvPicPr>
                   </pic:nvPicPr>
                   <pic:blipFill>
-                    <a:blip r:embed="rId138"/>
+                    <a:blip r:embed="rId141"/>
                     <a:stretch>
                       <a:fillRect/>
                     </a:stretch>
@@ -1963,7 +1985,7 @@
         <w:t xml:space="preserve">Переход в конец файла</w:t>
       </w:r>
     </w:p>
-    <w:bookmarkEnd w:id="141"/>
+    <w:bookmarkEnd w:id="144"/>
     <w:p>
       <w:pPr>
         <w:pStyle w:val="BodyText"/>
@@ -1972,7 +1994,7 @@
         <w:t xml:space="preserve">Перейдем в начало файла - PageUp или Ctrl+Z</w:t>
       </w:r>
     </w:p>
-    <w:bookmarkStart w:id="145" w:name="fig:032"/>
+    <w:bookmarkStart w:id="148" w:name="fig:032"/>
     <w:p>
       <w:pPr>
         <w:pStyle w:val="CaptionedFigure"/>
@@ -1982,18 +2004,18 @@
           <wp:inline>
             <wp:extent cx="3733800" cy="2656885"/>
             <wp:effectExtent b="0" l="0" r="0" t="0"/>
-            <wp:docPr descr="Переход в начало файла" title="" id="143" name="Picture"/>
+            <wp:docPr descr="Переход в начало файла" title="" id="146" name="Picture"/>
             <a:graphic>
               <a:graphicData uri="http://schemas.openxmlformats.org/drawingml/2006/picture">
                 <pic:pic>
                   <pic:nvPicPr>
-                    <pic:cNvPr descr="image/32.png" id="144" name="Picture"/>
+                    <pic:cNvPr descr="image/32.png" id="147" name="Picture"/>
                     <pic:cNvPicPr>
                       <a:picLocks noChangeArrowheads="1" noChangeAspect="1"/>
                     </pic:cNvPicPr>
                   </pic:nvPicPr>
                   <pic:blipFill>
-                    <a:blip r:embed="rId142"/>
+                    <a:blip r:embed="rId145"/>
                     <a:stretch>
                       <a:fillRect/>
                     </a:stretch>
@@ -2028,7 +2050,7 @@
         <w:t xml:space="preserve">Переход в начало файла</w:t>
       </w:r>
     </w:p>
-    <w:bookmarkEnd w:id="145"/>
+    <w:bookmarkEnd w:id="148"/>
     <w:p>
       <w:pPr>
         <w:pStyle w:val="BodyText"/>
@@ -2037,7 +2059,7 @@
         <w:t xml:space="preserve">11 Откроем файл с исходным текстом на языке программирования C</w:t>
       </w:r>
     </w:p>
-    <w:bookmarkStart w:id="149" w:name="fig:033"/>
+    <w:bookmarkStart w:id="152" w:name="fig:033"/>
     <w:p>
       <w:pPr>
         <w:pStyle w:val="CaptionedFigure"/>
@@ -2047,18 +2069,18 @@
           <wp:inline>
             <wp:extent cx="3733800" cy="2638701"/>
             <wp:effectExtent b="0" l="0" r="0" t="0"/>
-            <wp:docPr descr="Файл с программой" title="" id="147" name="Picture"/>
+            <wp:docPr descr="Файл с программой" title="" id="150" name="Picture"/>
             <a:graphic>
               <a:graphicData uri="http://schemas.openxmlformats.org/drawingml/2006/picture">
                 <pic:pic>
                   <pic:nvPicPr>
-                    <pic:cNvPr descr="image/33.png" id="148" name="Picture"/>
+                    <pic:cNvPr descr="image/33.png" id="151" name="Picture"/>
                     <pic:cNvPicPr>
                       <a:picLocks noChangeArrowheads="1" noChangeAspect="1"/>
                     </pic:cNvPicPr>
                   </pic:nvPicPr>
                   <pic:blipFill>
-                    <a:blip r:embed="rId146"/>
+                    <a:blip r:embed="rId149"/>
                     <a:stretch>
                       <a:fillRect/>
                     </a:stretch>
@@ -2093,7 +2115,7 @@
         <w:t xml:space="preserve">Файл с программой</w:t>
       </w:r>
     </w:p>
-    <w:bookmarkEnd w:id="149"/>
+    <w:bookmarkEnd w:id="152"/>
     <w:p>
       <w:pPr>
         <w:pStyle w:val="BodyText"/>
@@ -2102,7 +2124,7 @@
         <w:t xml:space="preserve">12 Используя меню редактора, выключим подсветку синтаксиса.</w:t>
       </w:r>
     </w:p>
-    <w:bookmarkStart w:id="153" w:name="fig:034"/>
+    <w:bookmarkStart w:id="156" w:name="fig:034"/>
     <w:p>
       <w:pPr>
         <w:pStyle w:val="CaptionedFigure"/>
@@ -2112,18 +2134,18 @@
           <wp:inline>
             <wp:extent cx="3733800" cy="2994996"/>
             <wp:effectExtent b="0" l="0" r="0" t="0"/>
-            <wp:docPr descr="Цветовыделение синтаксиса" title="" id="151" name="Picture"/>
+            <wp:docPr descr="Цветовыделение синтаксиса" title="" id="154" name="Picture"/>
             <a:graphic>
               <a:graphicData uri="http://schemas.openxmlformats.org/drawingml/2006/picture">
                 <pic:pic>
                   <pic:nvPicPr>
-                    <pic:cNvPr descr="image/34.png" id="152" name="Picture"/>
+                    <pic:cNvPr descr="image/34.png" id="155" name="Picture"/>
                     <pic:cNvPicPr>
                       <a:picLocks noChangeArrowheads="1" noChangeAspect="1"/>
                     </pic:cNvPicPr>
                   </pic:nvPicPr>
                   <pic:blipFill>
-                    <a:blip r:embed="rId150"/>
+                    <a:blip r:embed="rId153"/>
                     <a:stretch>
                       <a:fillRect/>
                     </a:stretch>
@@ -2158,9 +2180,9 @@
         <w:t xml:space="preserve">Цветовыделение синтаксиса</w:t>
       </w:r>
     </w:p>
-    <w:bookmarkEnd w:id="153"/>
-    <w:bookmarkEnd w:id="154"/>
-    <w:bookmarkStart w:id="155" w:name="вывод"/>
+    <w:bookmarkEnd w:id="156"/>
+    <w:bookmarkEnd w:id="157"/>
+    <w:bookmarkStart w:id="158" w:name="вывод"/>
     <w:p>
       <w:pPr>
         <w:pStyle w:val="Heading1"/>
@@ -2177,8 +2199,8 @@
         <w:t xml:space="preserve">В данной работе мы ознакомились с инструментами командной оболочки Midnight Commander. Приобрели навыки практической работы по просмотру каталогов и файлов</w:t>
       </w:r>
     </w:p>
-    <w:bookmarkEnd w:id="155"/>
-    <w:bookmarkStart w:id="156" w:name="контрольные-вопросы"/>
+    <w:bookmarkEnd w:id="158"/>
+    <w:bookmarkStart w:id="159" w:name="контрольные-вопросы"/>
     <w:p>
       <w:pPr>
         <w:pStyle w:val="Heading1"/>
@@ -2945,7 +2967,7 @@
         <w:t xml:space="preserve">инициализационный файл пользователя. Если он существует, то системный файл mc.ini игнорируется. $HOME/.mc.tree</w:t>
       </w:r>
     </w:p>
-    <w:bookmarkEnd w:id="156"/>
+    <w:bookmarkEnd w:id="159"/>
     <w:sectPr>
       <w:footnotePr>
         <w:numRestart w:val="eachSect"/>

</xml_diff>